<commit_message>
Mejoras Apartado 2 y la mitad del apartado 4.
</commit_message>
<xml_diff>
--- a/documentation/Informe del trabajo.docx
+++ b/documentation/Informe del trabajo.docx
@@ -1183,7 +1183,7 @@
           <w:lang w:eastAsia="en-US"/>
         </w:rPr>
         <w:drawing>
-          <wp:inline distT="0" distB="0" distL="0" distR="0" wp14:anchorId="2DF93B18" wp14:editId="0BD6AFF7">
+          <wp:inline distT="0" distB="0" distL="0" distR="0" wp14:anchorId="2DF93B18" wp14:editId="6110BD50">
             <wp:extent cx="5397500" cy="2137410"/>
             <wp:effectExtent l="0" t="0" r="0" b="0"/>
             <wp:docPr id="875891137" name="Picture 1"/>
@@ -4164,7 +4164,7 @@
       </w:pPr>
       <w:r>
         <w:drawing>
-          <wp:inline distT="0" distB="0" distL="0" distR="0" wp14:anchorId="678B59BD" wp14:editId="00DF268D">
+          <wp:inline distT="0" distB="0" distL="0" distR="0" wp14:anchorId="678B59BD" wp14:editId="23E69C8E">
             <wp:extent cx="4401768" cy="2556000"/>
             <wp:effectExtent l="0" t="0" r="0" b="0"/>
             <wp:docPr id="1412103006" name="Imagen 5"/>
@@ -4347,7 +4347,7 @@
       </w:pPr>
       <w:r>
         <w:drawing>
-          <wp:inline distT="0" distB="0" distL="0" distR="0" wp14:anchorId="5F603B3B" wp14:editId="616BD534">
+          <wp:inline distT="0" distB="0" distL="0" distR="0" wp14:anchorId="5F603B3B" wp14:editId="5DF8912F">
             <wp:extent cx="4532347" cy="2628000"/>
             <wp:effectExtent l="0" t="0" r="0" b="0"/>
             <wp:docPr id="642635995" name="Imagen 6"/>
@@ -4884,6 +4884,11 @@
       </w:r>
     </w:p>
     <w:p>
+      <w:r>
+        <w:t>Autoría:</w:t>
+      </w:r>
+    </w:p>
+    <w:p>
       <w:pPr>
         <w:pStyle w:val="ListParagraph"/>
         <w:numPr>
@@ -4990,6 +4995,12 @@
           <w:color w:val="000000"/>
         </w:rPr>
       </w:pPr>
+      <w:r>
+        <w:rPr>
+          <w:color w:val="000000"/>
+        </w:rPr>
+        <w:t>Pablo Romero Teruel</w:t>
+      </w:r>
     </w:p>
     <w:p>
       <w:pPr>
@@ -5041,6 +5052,12 @@
           <w:color w:val="000000"/>
         </w:rPr>
       </w:pPr>
+      <w:r>
+        <w:rPr>
+          <w:color w:val="000000"/>
+        </w:rPr>
+        <w:t>Pablo Romero Teruel</w:t>
+      </w:r>
     </w:p>
     <w:p>
       <w:pPr>
@@ -5117,6 +5134,12 @@
           <w:color w:val="000000"/>
         </w:rPr>
       </w:pPr>
+      <w:r>
+        <w:rPr>
+          <w:color w:val="000000"/>
+        </w:rPr>
+        <w:t>Antonio Urbano Murillo</w:t>
+      </w:r>
     </w:p>
     <w:p>
       <w:pPr>
@@ -11433,6 +11456,7 @@
   <w:style w:type="character" w:default="1" w:styleId="DefaultParagraphFont">
     <w:name w:val="Default Paragraph Font"/>
     <w:uiPriority w:val="1"/>
+    <w:semiHidden/>
     <w:unhideWhenUsed/>
   </w:style>
   <w:style w:type="table" w:default="1" w:styleId="TableNormal">
@@ -12822,6 +12846,10 @@
 </file>
 
 <file path=customXml/item1.xml><?xml version="1.0" encoding="utf-8"?>
+<b:Sources xmlns:b="http://schemas.openxmlformats.org/officeDocument/2006/bibliography" xmlns="http://schemas.openxmlformats.org/officeDocument/2006/bibliography" SelectedStyle="\APASixthEditionOfficeOnline.xsl" StyleName="APA" Version="6"/>
+</file>
+
+<file path=customXml/item2.xml><?xml version="1.0" encoding="utf-8"?>
 <?mso-contentType ?>
 <FormTemplates xmlns="http://schemas.microsoft.com/sharepoint/v3/contenttype/forms">
   <Display>DocumentLibraryForm</Display>
@@ -12830,17 +12858,7 @@
 </FormTemplates>
 </file>
 
-<file path=customXml/item2.xml><?xml version="1.0" encoding="utf-8"?>
-<b:Sources xmlns:b="http://schemas.openxmlformats.org/officeDocument/2006/bibliography" xmlns="http://schemas.openxmlformats.org/officeDocument/2006/bibliography" SelectedStyle="\APASixthEditionOfficeOnline.xsl" StyleName="APA" Version="6"/>
-</file>
-
 <file path=customXml/item3.xml><?xml version="1.0" encoding="utf-8"?>
-<p:properties xmlns:p="http://schemas.microsoft.com/office/2006/metadata/properties" xmlns:xsi="http://www.w3.org/2001/XMLSchema-instance" xmlns:pc="http://schemas.microsoft.com/office/infopath/2007/PartnerControls">
-  <documentManagement/>
-</p:properties>
-</file>
-
-<file path=customXml/item4.xml><?xml version="1.0" encoding="utf-8"?>
 <ct:contentTypeSchema xmlns:ct="http://schemas.microsoft.com/office/2006/metadata/contentType" xmlns:ma="http://schemas.microsoft.com/office/2006/metadata/properties/metaAttributes" ct:_="" ma:_="" ma:contentTypeName="Documento" ma:contentTypeID="0x01010005816C507664E340A43062961C043726" ma:contentTypeVersion="2" ma:contentTypeDescription="Crear nuevo documento." ma:contentTypeScope="" ma:versionID="adda2e20a47baa4167f223a185137a32">
   <xsd:schema xmlns:xsd="http://www.w3.org/2001/XMLSchema" xmlns:xs="http://www.w3.org/2001/XMLSchema" xmlns:p="http://schemas.microsoft.com/office/2006/metadata/properties" xmlns:ns2="17d05a7e-bf14-41c8-b0c5-da09d3b133e0" targetNamespace="http://schemas.microsoft.com/office/2006/metadata/properties" ma:root="true" ma:fieldsID="22695b4c6431d1952474eaa29992bf11" ns2:_="">
     <xsd:import namespace="17d05a7e-bf14-41c8-b0c5-da09d3b133e0"/>
@@ -12972,7 +12990,21 @@
 </ct:contentTypeSchema>
 </file>
 
+<file path=customXml/item4.xml><?xml version="1.0" encoding="utf-8"?>
+<p:properties xmlns:p="http://schemas.microsoft.com/office/2006/metadata/properties" xmlns:xsi="http://www.w3.org/2001/XMLSchema-instance" xmlns:pc="http://schemas.microsoft.com/office/infopath/2007/PartnerControls">
+  <documentManagement/>
+</p:properties>
+</file>
+
 <file path=customXml/itemProps1.xml><?xml version="1.0" encoding="utf-8"?>
+<ds:datastoreItem xmlns:ds="http://schemas.openxmlformats.org/officeDocument/2006/customXml" ds:itemID="{4271499D-4520-4918-8125-406B4565C133}">
+  <ds:schemaRefs>
+    <ds:schemaRef ds:uri="http://schemas.openxmlformats.org/officeDocument/2006/bibliography"/>
+  </ds:schemaRefs>
+</ds:datastoreItem>
+</file>
+
+<file path=customXml/itemProps2.xml><?xml version="1.0" encoding="utf-8"?>
 <ds:datastoreItem xmlns:ds="http://schemas.openxmlformats.org/officeDocument/2006/customXml" ds:itemID="{68FC53D6-4B1D-45A5-94CF-C792148F74B8}">
   <ds:schemaRefs>
     <ds:schemaRef ds:uri="http://schemas.microsoft.com/sharepoint/v3/contenttype/forms"/>
@@ -12980,24 +13012,7 @@
 </ds:datastoreItem>
 </file>
 
-<file path=customXml/itemProps2.xml><?xml version="1.0" encoding="utf-8"?>
-<ds:datastoreItem xmlns:ds="http://schemas.openxmlformats.org/officeDocument/2006/customXml" ds:itemID="{4271499D-4520-4918-8125-406B4565C133}">
-  <ds:schemaRefs>
-    <ds:schemaRef ds:uri="http://schemas.openxmlformats.org/officeDocument/2006/bibliography"/>
-  </ds:schemaRefs>
-</ds:datastoreItem>
-</file>
-
 <file path=customXml/itemProps3.xml><?xml version="1.0" encoding="utf-8"?>
-<ds:datastoreItem xmlns:ds="http://schemas.openxmlformats.org/officeDocument/2006/customXml" ds:itemID="{309EE98E-0D28-4A7C-A0A6-C0E416B02BA7}">
-  <ds:schemaRefs>
-    <ds:schemaRef ds:uri="http://schemas.microsoft.com/office/2006/metadata/properties"/>
-    <ds:schemaRef ds:uri="http://schemas.microsoft.com/office/infopath/2007/PartnerControls"/>
-  </ds:schemaRefs>
-</ds:datastoreItem>
-</file>
-
-<file path=customXml/itemProps4.xml><?xml version="1.0" encoding="utf-8"?>
 <ds:datastoreItem xmlns:ds="http://schemas.openxmlformats.org/officeDocument/2006/customXml" ds:itemID="{89239E26-6105-436A-81BF-E8DB98110BF2}">
   <ds:schemaRefs>
     <ds:schemaRef ds:uri="http://schemas.microsoft.com/office/2006/metadata/contentType"/>
@@ -13013,4 +13028,13 @@
     <ds:schemaRef ds:uri="http://schemas.microsoft.com/internal/obd"/>
   </ds:schemaRefs>
 </ds:datastoreItem>
+</file>
+
+<file path=customXml/itemProps4.xml><?xml version="1.0" encoding="utf-8"?>
+<ds:datastoreItem xmlns:ds="http://schemas.openxmlformats.org/officeDocument/2006/customXml" ds:itemID="{309EE98E-0D28-4A7C-A0A6-C0E416B02BA7}">
+  <ds:schemaRefs>
+    <ds:schemaRef ds:uri="http://schemas.microsoft.com/office/2006/metadata/properties"/>
+    <ds:schemaRef ds:uri="http://schemas.microsoft.com/office/infopath/2007/PartnerControls"/>
+  </ds:schemaRefs>
+</ds:datastoreItem>
 </file>
</xml_diff>

<commit_message>
Acabar 4.2 y parte del 4.3
</commit_message>
<xml_diff>
--- a/documentation/Informe del trabajo.docx
+++ b/documentation/Informe del trabajo.docx
@@ -352,7 +352,7 @@
         </w:rPr>
         <w:fldChar w:fldCharType="separate"/>
       </w:r>
-      <w:hyperlink w:anchor="_Toc224321740" w:history="1">
+      <w:hyperlink w:anchor="_Toc224382899" w:history="1">
         <w:r>
           <w:rPr>
             <w:rStyle w:val="Hyperlink"/>
@@ -375,7 +375,7 @@
           <w:rPr>
             <w:webHidden/>
           </w:rPr>
-          <w:instrText xml:space="preserve"> PAGEREF _Toc224321740 \h </w:instrText>
+          <w:instrText xml:space="preserve"> PAGEREF _Toc224382899 \h </w:instrText>
         </w:r>
         <w:r>
           <w:rPr>
@@ -417,7 +417,7 @@
           <w14:ligatures w14:val="standardContextual"/>
         </w:rPr>
       </w:pPr>
-      <w:hyperlink w:anchor="_Toc224321741" w:history="1">
+      <w:hyperlink w:anchor="_Toc224382900" w:history="1">
         <w:r>
           <w:rPr>
             <w:rStyle w:val="Hyperlink"/>
@@ -440,7 +440,7 @@
           <w:rPr>
             <w:webHidden/>
           </w:rPr>
-          <w:instrText xml:space="preserve"> PAGEREF _Toc224321741 \h </w:instrText>
+          <w:instrText xml:space="preserve"> PAGEREF _Toc224382900 \h </w:instrText>
         </w:r>
         <w:r>
           <w:rPr>
@@ -482,7 +482,7 @@
           <w14:ligatures w14:val="standardContextual"/>
         </w:rPr>
       </w:pPr>
-      <w:hyperlink w:anchor="_Toc224321742" w:history="1">
+      <w:hyperlink w:anchor="_Toc224382901" w:history="1">
         <w:r>
           <w:rPr>
             <w:rStyle w:val="Hyperlink"/>
@@ -505,7 +505,7 @@
           <w:rPr>
             <w:webHidden/>
           </w:rPr>
-          <w:instrText xml:space="preserve"> PAGEREF _Toc224321742 \h </w:instrText>
+          <w:instrText xml:space="preserve"> PAGEREF _Toc224382901 \h </w:instrText>
         </w:r>
         <w:r>
           <w:rPr>
@@ -547,7 +547,7 @@
           <w14:ligatures w14:val="standardContextual"/>
         </w:rPr>
       </w:pPr>
-      <w:hyperlink w:anchor="_Toc224321743" w:history="1">
+      <w:hyperlink w:anchor="_Toc224382902" w:history="1">
         <w:r>
           <w:rPr>
             <w:rStyle w:val="Hyperlink"/>
@@ -570,7 +570,7 @@
           <w:rPr>
             <w:webHidden/>
           </w:rPr>
-          <w:instrText xml:space="preserve"> PAGEREF _Toc224321743 \h </w:instrText>
+          <w:instrText xml:space="preserve"> PAGEREF _Toc224382902 \h </w:instrText>
         </w:r>
         <w:r>
           <w:rPr>
@@ -612,7 +612,7 @@
           <w14:ligatures w14:val="standardContextual"/>
         </w:rPr>
       </w:pPr>
-      <w:hyperlink w:anchor="_Toc224321744" w:history="1">
+      <w:hyperlink w:anchor="_Toc224382903" w:history="1">
         <w:r>
           <w:rPr>
             <w:rStyle w:val="Hyperlink"/>
@@ -635,7 +635,7 @@
           <w:rPr>
             <w:webHidden/>
           </w:rPr>
-          <w:instrText xml:space="preserve"> PAGEREF _Toc224321744 \h </w:instrText>
+          <w:instrText xml:space="preserve"> PAGEREF _Toc224382903 \h </w:instrText>
         </w:r>
         <w:r>
           <w:rPr>
@@ -677,7 +677,7 @@
           <w14:ligatures w14:val="standardContextual"/>
         </w:rPr>
       </w:pPr>
-      <w:hyperlink w:anchor="_Toc224321745" w:history="1">
+      <w:hyperlink w:anchor="_Toc224382904" w:history="1">
         <w:r>
           <w:rPr>
             <w:rStyle w:val="Hyperlink"/>
@@ -700,7 +700,7 @@
           <w:rPr>
             <w:webHidden/>
           </w:rPr>
-          <w:instrText xml:space="preserve"> PAGEREF _Toc224321745 \h </w:instrText>
+          <w:instrText xml:space="preserve"> PAGEREF _Toc224382904 \h </w:instrText>
         </w:r>
         <w:r>
           <w:rPr>
@@ -742,7 +742,7 @@
           <w14:ligatures w14:val="standardContextual"/>
         </w:rPr>
       </w:pPr>
-      <w:hyperlink w:anchor="_Toc224321746" w:history="1">
+      <w:hyperlink w:anchor="_Toc224382905" w:history="1">
         <w:r>
           <w:rPr>
             <w:rStyle w:val="Hyperlink"/>
@@ -765,7 +765,7 @@
           <w:rPr>
             <w:webHidden/>
           </w:rPr>
-          <w:instrText xml:space="preserve"> PAGEREF _Toc224321746 \h </w:instrText>
+          <w:instrText xml:space="preserve"> PAGEREF _Toc224382905 \h </w:instrText>
         </w:r>
         <w:r>
           <w:rPr>
@@ -807,12 +807,24 @@
           <w14:ligatures w14:val="standardContextual"/>
         </w:rPr>
       </w:pPr>
-      <w:hyperlink w:anchor="_Toc224321747" w:history="1">
+      <w:hyperlink w:anchor="_Toc224382906" w:history="1">
         <w:r>
           <w:rPr>
             <w:rStyle w:val="Hyperlink"/>
           </w:rPr>
-          <w:t>3.3. Precipitación en la celda 01</w:t>
+          <w:t>3.3. Precipita</w:t>
+        </w:r>
+        <w:r>
+          <w:rPr>
+            <w:rStyle w:val="Hyperlink"/>
+          </w:rPr>
+          <w:t>c</w:t>
+        </w:r>
+        <w:r>
+          <w:rPr>
+            <w:rStyle w:val="Hyperlink"/>
+          </w:rPr>
+          <w:t>ión en la celda 01</w:t>
         </w:r>
         <w:r>
           <w:rPr>
@@ -830,7 +842,7 @@
           <w:rPr>
             <w:webHidden/>
           </w:rPr>
-          <w:instrText xml:space="preserve"> PAGEREF _Toc224321747 \h </w:instrText>
+          <w:instrText xml:space="preserve"> PAGEREF _Toc224382906 \h </w:instrText>
         </w:r>
         <w:r>
           <w:rPr>
@@ -872,12 +884,24 @@
           <w14:ligatures w14:val="standardContextual"/>
         </w:rPr>
       </w:pPr>
-      <w:hyperlink w:anchor="_Toc224321748" w:history="1">
+      <w:hyperlink w:anchor="_Toc224382907" w:history="1">
         <w:r>
           <w:rPr>
             <w:rStyle w:val="Hyperlink"/>
           </w:rPr>
-          <w:t>8.1. xxxxxxxxxxxxx</w:t>
+          <w:t>8.1. xx</w:t>
+        </w:r>
+        <w:r>
+          <w:rPr>
+            <w:rStyle w:val="Hyperlink"/>
+          </w:rPr>
+          <w:t>x</w:t>
+        </w:r>
+        <w:r>
+          <w:rPr>
+            <w:rStyle w:val="Hyperlink"/>
+          </w:rPr>
+          <w:t>xxxxxxxxxx</w:t>
         </w:r>
         <w:r>
           <w:rPr>
@@ -895,7 +919,7 @@
           <w:rPr>
             <w:webHidden/>
           </w:rPr>
-          <w:instrText xml:space="preserve"> PAGEREF _Toc224321748 \h </w:instrText>
+          <w:instrText xml:space="preserve"> PAGEREF _Toc224382907 \h </w:instrText>
         </w:r>
         <w:r>
           <w:rPr>
@@ -912,7 +936,7 @@
           <w:rPr>
             <w:webHidden/>
           </w:rPr>
-          <w:t>25</w:t>
+          <w:t>26</w:t>
         </w:r>
         <w:r>
           <w:rPr>
@@ -937,7 +961,7 @@
           <w14:ligatures w14:val="standardContextual"/>
         </w:rPr>
       </w:pPr>
-      <w:hyperlink w:anchor="_Toc224321749" w:history="1">
+      <w:hyperlink w:anchor="_Toc224382908" w:history="1">
         <w:r>
           <w:rPr>
             <w:rStyle w:val="Hyperlink"/>
@@ -960,7 +984,7 @@
           <w:rPr>
             <w:webHidden/>
           </w:rPr>
-          <w:instrText xml:space="preserve"> PAGEREF _Toc224321749 \h </w:instrText>
+          <w:instrText xml:space="preserve"> PAGEREF _Toc224382908 \h </w:instrText>
         </w:r>
         <w:r>
           <w:rPr>
@@ -977,7 +1001,7 @@
           <w:rPr>
             <w:webHidden/>
           </w:rPr>
-          <w:t>25</w:t>
+          <w:t>26</w:t>
         </w:r>
         <w:r>
           <w:rPr>
@@ -1001,7 +1025,7 @@
           <w14:ligatures w14:val="standardContextual"/>
         </w:rPr>
       </w:pPr>
-      <w:hyperlink w:anchor="_Toc224321750" w:history="1">
+      <w:hyperlink w:anchor="_Toc224382909" w:history="1">
         <w:r>
           <w:rPr>
             <w:rStyle w:val="Hyperlink"/>
@@ -1024,7 +1048,7 @@
           <w:rPr>
             <w:webHidden/>
           </w:rPr>
-          <w:instrText xml:space="preserve"> PAGEREF _Toc224321750 \h </w:instrText>
+          <w:instrText xml:space="preserve"> PAGEREF _Toc224382909 \h </w:instrText>
         </w:r>
         <w:r>
           <w:rPr>
@@ -1041,7 +1065,7 @@
           <w:rPr>
             <w:webHidden/>
           </w:rPr>
-          <w:t>25</w:t>
+          <w:t>26</w:t>
         </w:r>
         <w:r>
           <w:rPr>
@@ -1150,7 +1174,7 @@
       <w:pPr>
         <w:pStyle w:val="Heading2"/>
       </w:pPr>
-      <w:bookmarkStart w:id="0" w:name="_Toc224321740"/>
+      <w:bookmarkStart w:id="0" w:name="_Toc224382899"/>
       <w:r>
         <w:t>Distribución en las celdas 01 y 10</w:t>
       </w:r>
@@ -2084,7 +2108,7 @@
       <w:pPr>
         <w:pStyle w:val="Heading2"/>
       </w:pPr>
-      <w:bookmarkStart w:id="1" w:name="_Toc224321741"/>
+      <w:bookmarkStart w:id="1" w:name="_Toc224382900"/>
       <w:r>
         <w:lastRenderedPageBreak/>
         <w:t>Cambios según día de la semana, mes y año.</w:t>
@@ -2520,7 +2544,7 @@
       <w:pPr>
         <w:pStyle w:val="Heading2"/>
       </w:pPr>
-      <w:bookmarkStart w:id="2" w:name="_Toc224321742"/>
+      <w:bookmarkStart w:id="2" w:name="_Toc224382901"/>
       <w:r>
         <w:t>dsuihf</w:t>
       </w:r>
@@ -2535,7 +2559,7 @@
       <w:pPr>
         <w:pStyle w:val="Heading2"/>
       </w:pPr>
-      <w:bookmarkStart w:id="3" w:name="_Toc224321743"/>
+      <w:bookmarkStart w:id="3" w:name="_Toc224382902"/>
       <w:r>
         <w:t>Relaciones entre los datos de</w:t>
       </w:r>
@@ -2848,7 +2872,7 @@
       <w:pPr>
         <w:pStyle w:val="Heading2"/>
       </w:pPr>
-      <w:bookmarkStart w:id="4" w:name="_Toc224321744"/>
+      <w:bookmarkStart w:id="4" w:name="_Toc224382903"/>
       <w:r>
         <w:lastRenderedPageBreak/>
         <w:t>Relaciones para irradiación y precipitación.</w:t>
@@ -3402,7 +3426,7 @@
       <w:pPr>
         <w:pStyle w:val="Heading2"/>
       </w:pPr>
-      <w:bookmarkStart w:id="5" w:name="_Toc224321745"/>
+      <w:bookmarkStart w:id="5" w:name="_Toc224382904"/>
       <w:r>
         <w:t>Temperatura en la celda 01</w:t>
       </w:r>
@@ -3858,7 +3882,7 @@
       <w:pPr>
         <w:pStyle w:val="Heading2"/>
       </w:pPr>
-      <w:bookmarkStart w:id="10" w:name="_Toc224321746"/>
+      <w:bookmarkStart w:id="10" w:name="_Toc224382905"/>
       <w:r>
         <w:t>Irradiación en la celda 01</w:t>
       </w:r>
@@ -4329,7 +4353,7 @@
       <w:pPr>
         <w:pStyle w:val="Heading2"/>
       </w:pPr>
-      <w:bookmarkStart w:id="14" w:name="_Toc224321747"/>
+      <w:bookmarkStart w:id="14" w:name="_Toc224382906"/>
       <w:r>
         <w:t>Precipitación en la celda 01</w:t>
       </w:r>
@@ -5434,7 +5458,7 @@
       <w:pPr>
         <w:pStyle w:val="Heading2"/>
       </w:pPr>
-      <w:bookmarkStart w:id="18" w:name="_Toc224321748"/>
+      <w:bookmarkStart w:id="18" w:name="_Toc224382907"/>
       <w:r>
         <w:t>xxxxxxxxxxxxx</w:t>
       </w:r>
@@ -5449,7 +5473,7 @@
       <w:pPr>
         <w:pStyle w:val="Heading2"/>
       </w:pPr>
-      <w:bookmarkStart w:id="19" w:name="_Toc224321749"/>
+      <w:bookmarkStart w:id="19" w:name="_Toc224382908"/>
       <w:r>
         <w:t>xxxxxxxxxxxxxxxxxxx</w:t>
       </w:r>
@@ -5459,7 +5483,7 @@
       <w:pPr>
         <w:pStyle w:val="Heading3"/>
       </w:pPr>
-      <w:bookmarkStart w:id="20" w:name="_Toc224321750"/>
+      <w:bookmarkStart w:id="20" w:name="_Toc224382909"/>
       <w:r>
         <w:t>Xxxxxxx</w:t>
       </w:r>

</xml_diff>